<commit_message>
feat(dotnet): port dos Efeitos de Forma — ShapeStyle.Fx, ShapeItem.Fx e os rasters no PDF; a camada inclui a metade de fora do contorno
Espelha 404b3d1a e 149c99a0 (sombra interna só com preenchimento) no OfficeNext.Docx
(ReadShapeFx), DocxLayout (ShapeExtras/Engine/Tree, PaintShapeEffectsPdf) e no dump
de paridade (fx só quando há). textboxes.docx ganha cinco caixas com efeitos (brilho
num anel de contorno, bordas suaves, sombra interna, reflexo, sombra em perspectiva
numa caixa girada). JS e .NET: as 19 imagens e as páginas do PDF iguais byte a byte
(descomprimidas). Correção nos dois: o contorno centrado entra na caixa da camada
(antes a metade de fora do anel era cortada). dotnet test 7199/7199.

Co-Authored-By: Claude Opus 5.5 <noreply@anthropic.com>
</commit_message>
<xml_diff>
--- a/dotnet/tests/fixtures/input/textboxes.docx
+++ b/dotnet/tests/fixtures/input/textboxes.docx
@@ -1211,6 +1211,322 @@
                       <w:p>
                         <w:r>
                           <w:t xml:space="preserve">Último técnica será cliente uma que relatório prazo atendimento informação.</w:t>
+                        </w:r>
+                      </w:p>
+                    </w:txbxContent>
+                  </wps:txbx>
+                  <wps:bodyPr rot="0" spcFirstLastPara="0" vertOverflow="overflow" horzOverflow="overflow" vert="horz" wrap="square" lIns="91440" tIns="45720" rIns="91440" bIns="45720" numCol="1" spcCol="0" rtlCol="0" fromWordArt="0" anchor="t" anchorCtr="0" forceAA="0" compatLnSpc="1">
+                    <a:prstTxWarp prst="textNoShape">
+                      <a:avLst/>
+                    </a:prstTxWarp>
+                    <a:noAutofit/>
+                  </wps:bodyPr>
+                </wps:wsp>
+              </a:graphicData>
+            </a:graphic>
+          </wp:anchor>
+        </w:drawing>
+      </w:r>
+      <w:r>
+        <w:drawing>
+          <wp:anchor distT="0" distB="0" distL="114300" distR="114300" simplePos="0" relativeHeight="251680768" behindDoc="0" locked="0" layoutInCell="1" allowOverlap="1">
+            <wp:simplePos x="0" y="0"/>
+            <wp:positionH relativeFrom="page">
+              <wp:posOffset>762000</wp:posOffset>
+            </wp:positionH>
+            <wp:positionV relativeFrom="page">
+              <wp:posOffset>7937500</wp:posOffset>
+            </wp:positionV>
+            <wp:extent cx="1079500" cy="635000"/>
+            <wp:effectExtent l="0" t="0" r="0" b="0"/>
+            <wp:wrapNone/>
+            <wp:docPr id="122" name="Caixa de Texto 22"/>
+            <wp:cNvGraphicFramePr/>
+            <a:graphic>
+              <a:graphicData uri="http://schemas.microsoft.com/office/word/2010/wordprocessingShape">
+                <wps:wsp>
+                  <wps:cNvSpPr txBox="1"/>
+                  <wps:spPr>
+                    <a:xfrm>
+                      <a:off x="0" y="0"/>
+                      <a:ext cx="1079500" cy="635000"/>
+                    </a:xfrm>
+                    <a:prstGeom prst="rect">
+                      <a:avLst/>
+                    </a:prstGeom>
+                    <a:noFill/>
+                    <a:ln w="19050">
+                      <a:solidFill>
+                        <a:srgbClr val="C00000"/>
+                      </a:solidFill>
+                    </a:ln>
+                    <a:effectLst>
+                      <a:glow rad="101600">
+                        <a:schemeClr val="accent6">
+                          <a:alpha val="60000"/>
+                        </a:schemeClr>
+                      </a:glow>
+                      <a:outerShdw blurRad="50800" dist="38100" dir="2700000" algn="tl" rotWithShape="0">
+                        <a:prstClr val="black">
+                          <a:alpha val="40000"/>
+                        </a:prstClr>
+                      </a:outerShdw>
+                    </a:effectLst>
+                  </wps:spPr>
+                  <wps:txbx>
+                    <w:txbxContent>
+                      <w:p>
+                        <w:r>
+                          <w:t xml:space="preserve">Serviço área execução processo para qualidade.</w:t>
+                        </w:r>
+                      </w:p>
+                    </w:txbxContent>
+                  </wps:txbx>
+                  <wps:bodyPr rot="0" spcFirstLastPara="0" vertOverflow="overflow" horzOverflow="overflow" vert="horz" wrap="square" lIns="91440" tIns="45720" rIns="91440" bIns="45720" numCol="1" spcCol="0" rtlCol="0" fromWordArt="0" anchor="t" anchorCtr="0" forceAA="0" compatLnSpc="1">
+                    <a:prstTxWarp prst="textNoShape">
+                      <a:avLst/>
+                    </a:prstTxWarp>
+                    <a:noAutofit/>
+                  </wps:bodyPr>
+                </wps:wsp>
+              </a:graphicData>
+            </a:graphic>
+          </wp:anchor>
+        </w:drawing>
+      </w:r>
+      <w:r>
+        <w:drawing>
+          <wp:anchor distT="0" distB="0" distL="114300" distR="114300" simplePos="0" relativeHeight="251681792" behindDoc="0" locked="0" layoutInCell="1" allowOverlap="1">
+            <wp:simplePos x="0" y="0"/>
+            <wp:positionH relativeFrom="page">
+              <wp:posOffset>2095500</wp:posOffset>
+            </wp:positionH>
+            <wp:positionV relativeFrom="page">
+              <wp:posOffset>7937500</wp:posOffset>
+            </wp:positionV>
+            <wp:extent cx="1079500" cy="635000"/>
+            <wp:effectExtent l="0" t="0" r="0" b="0"/>
+            <wp:wrapNone/>
+            <wp:docPr id="123" name="Caixa de Texto 23"/>
+            <wp:cNvGraphicFramePr/>
+            <a:graphic>
+              <a:graphicData uri="http://schemas.microsoft.com/office/word/2010/wordprocessingShape">
+                <wps:wsp>
+                  <wps:cNvSpPr txBox="1"/>
+                  <wps:spPr>
+                    <a:xfrm>
+                      <a:off x="0" y="0"/>
+                      <a:ext cx="1079500" cy="635000"/>
+                    </a:xfrm>
+                    <a:prstGeom prst="rect">
+                      <a:avLst/>
+                    </a:prstGeom>
+                    <a:solidFill>
+                      <a:schemeClr val="accent1">
+                        <a:lumMod val="75000"/>
+                      </a:schemeClr>
+                    </a:solidFill>
+                    <a:ln>
+                      <a:noFill/>
+                    </a:ln>
+                    <a:effectLst>
+                      <a:softEdge rad="63500"/>
+                    </a:effectLst>
+                  </wps:spPr>
+                  <wps:txbx>
+                    <w:txbxContent>
+                      <w:p>
+                        <w:r>
+                          <w:rPr>
+                            <w:color w:val="FFFFFF"/>
+                          </w:rPr>
+                          <w:t xml:space="preserve">Empresa segurança operação não documento o.</w:t>
+                        </w:r>
+                      </w:p>
+                    </w:txbxContent>
+                  </wps:txbx>
+                  <wps:bodyPr rot="0" spcFirstLastPara="0" vertOverflow="overflow" horzOverflow="overflow" vert="horz" wrap="square" lIns="91440" tIns="45720" rIns="91440" bIns="45720" numCol="1" spcCol="0" rtlCol="0" fromWordArt="0" anchor="t" anchorCtr="0" forceAA="0" compatLnSpc="1">
+                    <a:prstTxWarp prst="textNoShape">
+                      <a:avLst/>
+                    </a:prstTxWarp>
+                    <a:noAutofit/>
+                  </wps:bodyPr>
+                </wps:wsp>
+              </a:graphicData>
+            </a:graphic>
+          </wp:anchor>
+        </w:drawing>
+      </w:r>
+      <w:r>
+        <w:drawing>
+          <wp:anchor distT="0" distB="0" distL="114300" distR="114300" simplePos="0" relativeHeight="251682816" behindDoc="0" locked="0" layoutInCell="1" allowOverlap="1">
+            <wp:simplePos x="0" y="0"/>
+            <wp:positionH relativeFrom="page">
+              <wp:posOffset>3429000</wp:posOffset>
+            </wp:positionH>
+            <wp:positionV relativeFrom="page">
+              <wp:posOffset>7937500</wp:posOffset>
+            </wp:positionV>
+            <wp:extent cx="1079500" cy="635000"/>
+            <wp:effectExtent l="0" t="0" r="0" b="0"/>
+            <wp:wrapNone/>
+            <wp:docPr id="124" name="Caixa de Texto 24"/>
+            <wp:cNvGraphicFramePr/>
+            <a:graphic>
+              <a:graphicData uri="http://schemas.microsoft.com/office/word/2010/wordprocessingShape">
+                <wps:wsp>
+                  <wps:cNvSpPr txBox="1"/>
+                  <wps:spPr>
+                    <a:xfrm>
+                      <a:off x="0" y="0"/>
+                      <a:ext cx="1079500" cy="635000"/>
+                    </a:xfrm>
+                    <a:prstGeom prst="rect">
+                      <a:avLst/>
+                    </a:prstGeom>
+                    <a:solidFill>
+                      <a:srgbClr val="FFF2CC"/>
+                    </a:solidFill>
+                    <a:ln w="9525">
+                      <a:solidFill>
+                        <a:srgbClr val="7F6000"/>
+                      </a:solidFill>
+                    </a:ln>
+                    <a:effectLst>
+                      <a:innerShdw blurRad="63500" dist="50800" dir="13500000">
+                        <a:prstClr val="black">
+                          <a:alpha val="50000"/>
+                        </a:prstClr>
+                      </a:innerShdw>
+                    </a:effectLst>
+                  </wps:spPr>
+                  <wps:txbx>
+                    <w:txbxContent>
+                      <w:p>
+                        <w:r>
+                          <w:t xml:space="preserve">Aprovação gestão controle responsável conforme com.</w:t>
+                        </w:r>
+                      </w:p>
+                    </w:txbxContent>
+                  </wps:txbx>
+                  <wps:bodyPr rot="0" spcFirstLastPara="0" vertOverflow="overflow" horzOverflow="overflow" vert="horz" wrap="square" lIns="91440" tIns="45720" rIns="91440" bIns="45720" numCol="1" spcCol="0" rtlCol="0" fromWordArt="0" anchor="t" anchorCtr="0" forceAA="0" compatLnSpc="1">
+                    <a:prstTxWarp prst="textNoShape">
+                      <a:avLst/>
+                    </a:prstTxWarp>
+                    <a:noAutofit/>
+                  </wps:bodyPr>
+                </wps:wsp>
+              </a:graphicData>
+            </a:graphic>
+          </wp:anchor>
+        </w:drawing>
+      </w:r>
+      <w:r>
+        <w:drawing>
+          <wp:anchor distT="0" distB="0" distL="114300" distR="114300" simplePos="0" relativeHeight="251683840" behindDoc="0" locked="0" layoutInCell="1" allowOverlap="1">
+            <wp:simplePos x="0" y="0"/>
+            <wp:positionH relativeFrom="page">
+              <wp:posOffset>4762500</wp:posOffset>
+            </wp:positionH>
+            <wp:positionV relativeFrom="page">
+              <wp:posOffset>7937500</wp:posOffset>
+            </wp:positionV>
+            <wp:extent cx="1079500" cy="635000"/>
+            <wp:effectExtent l="0" t="0" r="0" b="0"/>
+            <wp:wrapNone/>
+            <wp:docPr id="125" name="Caixa de Texto 25"/>
+            <wp:cNvGraphicFramePr/>
+            <a:graphic>
+              <a:graphicData uri="http://schemas.microsoft.com/office/word/2010/wordprocessingShape">
+                <wps:wsp>
+                  <wps:cNvSpPr txBox="1"/>
+                  <wps:spPr>
+                    <a:xfrm>
+                      <a:off x="0" y="0"/>
+                      <a:ext cx="1079500" cy="635000"/>
+                    </a:xfrm>
+                    <a:prstGeom prst="rect">
+                      <a:avLst/>
+                    </a:prstGeom>
+                    <a:solidFill>
+                      <a:srgbClr val="5B9BD5"/>
+                    </a:solidFill>
+                    <a:ln>
+                      <a:noFill/>
+                    </a:ln>
+                    <a:effectLst>
+                      <a:reflection blurRad="6350" stA="52000" endA="300" endPos="35000" dist="12700" dir="5400000" sy="-100000" algn="bl" rotWithShape="0"/>
+                    </a:effectLst>
+                  </wps:spPr>
+                  <wps:txbx>
+                    <w:txbxContent>
+                      <w:p>
+                        <w:r>
+                          <w:t xml:space="preserve">Análise serviço área execução processo para.</w:t>
+                        </w:r>
+                      </w:p>
+                    </w:txbxContent>
+                  </wps:txbx>
+                  <wps:bodyPr rot="0" spcFirstLastPara="0" vertOverflow="overflow" horzOverflow="overflow" vert="horz" wrap="square" lIns="91440" tIns="45720" rIns="91440" bIns="45720" numCol="1" spcCol="0" rtlCol="0" fromWordArt="0" anchor="t" anchorCtr="0" forceAA="0" compatLnSpc="1">
+                    <a:prstTxWarp prst="textNoShape">
+                      <a:avLst/>
+                    </a:prstTxWarp>
+                    <a:noAutofit/>
+                  </wps:bodyPr>
+                </wps:wsp>
+              </a:graphicData>
+            </a:graphic>
+          </wp:anchor>
+        </w:drawing>
+      </w:r>
+      <w:r>
+        <w:drawing>
+          <wp:anchor distT="0" distB="0" distL="114300" distR="114300" simplePos="0" relativeHeight="251684864" behindDoc="0" locked="0" layoutInCell="1" allowOverlap="1">
+            <wp:simplePos x="0" y="0"/>
+            <wp:positionH relativeFrom="page">
+              <wp:posOffset>6096000</wp:posOffset>
+            </wp:positionH>
+            <wp:positionV relativeFrom="page">
+              <wp:posOffset>7937500</wp:posOffset>
+            </wp:positionV>
+            <wp:extent cx="1079500" cy="635000"/>
+            <wp:effectExtent l="0" t="0" r="0" b="0"/>
+            <wp:wrapNone/>
+            <wp:docPr id="126" name="Caixa de Texto 26"/>
+            <wp:cNvGraphicFramePr/>
+            <a:graphic>
+              <a:graphicData uri="http://schemas.microsoft.com/office/word/2010/wordprocessingShape">
+                <wps:wsp>
+                  <wps:cNvSpPr txBox="1"/>
+                  <wps:spPr>
+                    <a:xfrm rot="600000">
+                      <a:off x="0" y="0"/>
+                      <a:ext cx="1079500" cy="635000"/>
+                    </a:xfrm>
+                    <a:prstGeom prst="rect">
+                      <a:avLst/>
+                    </a:prstGeom>
+                    <a:solidFill>
+                      <a:srgbClr val="E2F0D9"/>
+                    </a:solidFill>
+                    <a:ln w="9525">
+                      <a:solidFill>
+                        <a:srgbClr val="385723"/>
+                      </a:solidFill>
+                    </a:ln>
+                    <a:effectLst>
+                      <a:outerShdw blurRad="76200" dist="12700" dir="18900000" sy="23000" kx="-1200000" algn="bl" rotWithShape="0">
+                        <a:prstClr val="black">
+                          <a:alpha val="20000"/>
+                        </a:prstClr>
+                      </a:outerShdw>
+                    </a:effectLst>
+                  </wps:spPr>
+                  <wps:txbx>
+                    <w:txbxContent>
+                      <w:p>
+                        <w:r>
+                          <w:t xml:space="preserve">Registro último técnica será cliente uma.</w:t>
                         </w:r>
                       </w:p>
                     </w:txbxContent>

</xml_diff>